<commit_message>
W 10-14: outline w/ videos (Stage: videos, 11/11 picks, B rows swapped), manifest, report, yield log
Co-Authored-By: Claude Opus 5.5 <noreply@anthropic.com>
Claude-Session: https://claude.ai/code/session_01F5T5EfKU7bvTfCbU31zr39
</commit_message>
<xml_diff>
--- a/runs/W_10142026/10_14_OUTLINE_WED.docx
+++ b/runs/W_10142026/10_14_OUTLINE_WED.docx
@@ -39,7 +39,7 @@
         <w:t>Guest:</w:t>
       </w:r>
       <w:r>
-        <w:t xml:space="preserve"> not booked (Amy Nofziger, AARP, suggested) · </w:t>
+        <w:t xml:space="preserve"> none (producer, 10/6) · </w:t>
       </w:r>
       <w:r>
         <w:rPr>
@@ -57,7 +57,7 @@
         <w:t>Stage:</w:t>
       </w:r>
       <w:r>
-        <w:t xml:space="preserve"> beats</w:t>
+        <w:t xml:space="preserve"> videos</w:t>
       </w:r>
     </w:p>
     <w:p>
@@ -271,7 +271,7 @@
               <w:rPr>
                 <w:sz w:val="19"/>
               </w:rPr>
-              <w:t>6</w:t>
+              <w:t>6/6</w:t>
             </w:r>
           </w:p>
         </w:tc>
@@ -403,7 +403,7 @@
               <w:rPr>
                 <w:sz w:val="19"/>
               </w:rPr>
-              <w:t>3</w:t>
+              <w:t>3/3</w:t>
             </w:r>
           </w:p>
         </w:tc>
@@ -535,7 +535,7 @@
               <w:rPr>
                 <w:sz w:val="19"/>
               </w:rPr>
-              <w:t>2</w:t>
+              <w:t>2/2</w:t>
             </w:r>
           </w:p>
         </w:tc>
@@ -622,7 +622,7 @@
     </w:p>
     <w:p>
       <w:r>
-        <w:t>A free sample at the mall turns into a chair, a pitch and a bill in the tens of thousands, and the same playbook is hitting older shoppers from Florida to Washington. A caregiver became a 75-year-old man's power of attorney and signed his house over to herself for $5, and his daughter found out through the doorbell. A fake AI "government" video wants your Social Security number for a tax freeze that doesn't exist, and every one of these has a one-line fix.</w:t>
+        <w:t>A free sample at the mall turns into a chair, a pitch and a bill in the tens of thousands, and the same playbook is hitting older shoppers from Florida to Washington. A daughter rang her father's doorbell and heard his caregiver say he had died, then learned the caregiver had become his power of attorney and signed his house over to herself for $5. A fake AI "government" video wants your Social Security number for a tax freeze that doesn't exist, and every one of these has a one-line fix.</w:t>
       </w:r>
     </w:p>
     <w:p>
@@ -669,7 +669,7 @@
         <w:spacing w:after="40"/>
       </w:pPr>
       <w:r>
-        <w:t>A beat 2: the $26,000 widow is a June 2025 case. Open on her as "last year," or open on a 2026 CBS LA victim and use her as the dollar figure?</w:t>
+        <w:t>A beat 2: the $26,000 widow is a June 2025 case. Producer, 10/6: leave as is, decide the framing later.</w:t>
       </w:r>
     </w:p>
     <w:p>
@@ -678,7 +678,7 @@
         <w:spacing w:after="40"/>
       </w:pPr>
       <w:r>
-        <w:t>A runs 6 clip beats against Matt's guide of about two per segment. Beats 5 and 6 are the same outlet (CBS LA) and the softest cut.</w:t>
+        <w:t>A runs 6 clip beats against Matt's guide of about two per segment. Producer, 10/6: keep all six for now; beats 5 and 6 (both CBS LA) are the first cut if A runs long.</w:t>
       </w:r>
     </w:p>
     <w:p>
@@ -687,7 +687,25 @@
         <w:spacing w:after="40"/>
       </w:pPr>
       <w:r>
-        <w:t>B beat 2: the tease line "Your dad died" is a paraphrase. Use the clip's actual words.</w:t>
+        <w:t>B rows swapped at Checkpoint 3 (producer, 10/6): B now opens on the doorbell (the 5.7M Short), then the $5 deed.</w:t>
+      </w:r>
+    </w:p>
+    <w:p>
+      <w:pPr>
+        <w:pStyle w:val="ListBullet"/>
+        <w:spacing w:after="40"/>
+      </w:pPr>
+      <w:r>
+        <w:t>B beat 1: "Your dad died" is on tape, as Nora retelling what the caregiver said, not the Ring audio itself.</w:t>
+      </w:r>
+    </w:p>
+    <w:p>
+      <w:pPr>
+        <w:pStyle w:val="ListBullet"/>
+        <w:spacing w:after="40"/>
+      </w:pPr>
+      <w:r>
+        <w:t>B beat 1: the Short is WSMV's repost of WMBF's story. Clear it through Gray, or use WMBF's original (same audio).</w:t>
       </w:r>
     </w:p>
     <w:p>
@@ -705,7 +723,7 @@
         <w:spacing w:after="40"/>
       </w:pPr>
       <w:r>
-        <w:t>C has no victim: beat 1 is the fake video itself. Run it as a quick warning, or ask the help line for a caller who saw it.</w:t>
+        <w:t>C has no victim. Producer, 10/6: beat 1 runs as B-roll of the fake video with Jeff talking over it. Denver7 plays the fake video; no real channel is labelled as the scam.</w:t>
       </w:r>
     </w:p>
     <w:p>
@@ -714,7 +732,25 @@
         <w:spacing w:after="40"/>
       </w:pPr>
       <w:r>
-        <w:t>Expert not booked. Without one, A beat 8 and B beat 4 stay with Jeff.</w:t>
+        <w:t>C: the Colorado assessor thinks the videos exist to sell ad clicks; Wisconsin's revenue department says the phone numbers reach scammers. Attribute each.</w:t>
+      </w:r>
+    </w:p>
+    <w:p>
+      <w:pPr>
+        <w:pStyle w:val="ListBullet"/>
+        <w:spacing w:after="40"/>
+      </w:pPr>
+      <w:r>
+        <w:t>Picks: 11/11, all affiliate or network news (no first-person or creator option cleared the filters). No EMPTY, WEAK or THROTTLED beats.</w:t>
+      </w:r>
+    </w:p>
+    <w:p>
+      <w:pPr>
+        <w:pStyle w:val="ListBullet"/>
+        <w:spacing w:after="40"/>
+      </w:pPr>
+      <w:r>
+        <w:t>No expert this week (producer, 10/6). A beat 8 and B beat 4 stay with Jeff.</w:t>
       </w:r>
     </w:p>
     <w:p>
@@ -1227,7 +1263,7 @@
               <w:rPr>
                 <w:sz w:val="19"/>
               </w:rPr>
-              <w:t>Older and disabled Bee &amp; Co. customers, including an 80-year-old woman</w:t>
+              <w:t>Rep. Brad Sherman; two women in their 80s, Arcadia</w:t>
             </w:r>
           </w:p>
         </w:tc>
@@ -1243,7 +1279,7 @@
               <w:rPr>
                 <w:sz w:val="19"/>
               </w:rPr>
-              <w:t>New complaints pile up across Southern California malls, and a congressman takes it to the attorney general.</w:t>
+              <w:t>A congressman takes it to the attorney general, and two women in their 80s say they were pressured at sister stores.</w:t>
             </w:r>
           </w:p>
         </w:tc>
@@ -1521,6 +1557,617 @@
           <w:color w:val="333333"/>
           <w:sz w:val="22"/>
         </w:rPr>
+        <w:t>Videos</w:t>
+      </w:r>
+    </w:p>
+    <w:tbl>
+      <w:tblPr>
+        <w:tblStyle w:val="TableGrid"/>
+        <w:tblW w:type="auto" w:w="0"/>
+        <w:jc w:val="center"/>
+        <w:tblLayout w:type="fixed"/>
+        <w:tblLook w:firstColumn="1" w:firstRow="1" w:lastColumn="0" w:lastRow="0" w:noHBand="0" w:noVBand="1" w:val="04A0"/>
+      </w:tblPr>
+      <w:tblGrid>
+        <w:gridCol w:w="432"/>
+        <w:gridCol w:w="2664"/>
+        <w:gridCol w:w="3096"/>
+        <w:gridCol w:w="2376"/>
+        <w:gridCol w:w="1368"/>
+      </w:tblGrid>
+      <w:tr>
+        <w:tc>
+          <w:tcPr>
+            <w:tcW w:type="dxa" w:w="432"/>
+          </w:tcPr>
+          <w:p>
+            <w:r>
+              <w:rPr>
+                <w:b/>
+                <w:sz w:val="19"/>
+              </w:rPr>
+              <w:t>#</w:t>
+            </w:r>
+          </w:p>
+        </w:tc>
+        <w:tc>
+          <w:tcPr>
+            <w:tcW w:type="dxa" w:w="2664"/>
+          </w:tcPr>
+          <w:p>
+            <w:r>
+              <w:rPr>
+                <w:b/>
+                <w:sz w:val="19"/>
+              </w:rPr>
+              <w:t>Clip</w:t>
+            </w:r>
+          </w:p>
+        </w:tc>
+        <w:tc>
+          <w:tcPr>
+            <w:tcW w:type="dxa" w:w="3096"/>
+          </w:tcPr>
+          <w:p>
+            <w:r>
+              <w:rPr>
+                <w:b/>
+                <w:sz w:val="19"/>
+              </w:rPr>
+              <w:t>Shows</w:t>
+            </w:r>
+          </w:p>
+        </w:tc>
+        <w:tc>
+          <w:tcPr>
+            <w:tcW w:type="dxa" w:w="2376"/>
+          </w:tcPr>
+          <w:p>
+            <w:r>
+              <w:rPr>
+                <w:b/>
+                <w:sz w:val="19"/>
+              </w:rPr>
+              <w:t>In–Out</w:t>
+            </w:r>
+          </w:p>
+        </w:tc>
+        <w:tc>
+          <w:tcPr>
+            <w:tcW w:type="dxa" w:w="1368"/>
+          </w:tcPr>
+          <w:p>
+            <w:r>
+              <w:rPr>
+                <w:b/>
+                <w:sz w:val="19"/>
+              </w:rPr>
+              <w:t>Status</w:t>
+            </w:r>
+          </w:p>
+        </w:tc>
+      </w:tr>
+      <w:tr>
+        <w:tc>
+          <w:tcPr>
+            <w:tcW w:type="dxa" w:w="432"/>
+          </w:tcPr>
+          <w:p>
+            <w:pPr>
+              <w:spacing w:after="40"/>
+            </w:pPr>
+            <w:r>
+              <w:rPr>
+                <w:sz w:val="19"/>
+              </w:rPr>
+              <w:t>2</w:t>
+            </w:r>
+          </w:p>
+        </w:tc>
+        <w:tc>
+          <w:tcPr>
+            <w:tcW w:type="dxa" w:w="2664"/>
+          </w:tcPr>
+          <w:p>
+            <w:pPr>
+              <w:spacing w:after="40"/>
+            </w:pPr>
+            <w:hyperlink r:id="rId9">
+              <w:r>
+                <w:rPr>
+                  <w:color w:val="1155CC"/>
+                  <w:u w:val="single"/>
+                </w:rPr>
+                <w:t xml:space="preserve">First Coast News — $25 facial cost an 84-year-old widow $26,000</w:t>
+              </w:r>
+            </w:hyperlink>
+          </w:p>
+        </w:tc>
+        <w:tc>
+          <w:tcPr>
+            <w:tcW w:type="dxa" w:w="3096"/>
+          </w:tcPr>
+          <w:p>
+            <w:pPr>
+              <w:spacing w:after="40"/>
+            </w:pPr>
+            <w:r>
+              <w:rPr>
+                <w:sz w:val="19"/>
+              </w:rPr>
+              <w:t>Taylor ashamed she told no one; "I was being shifted around." Uploaded June 5, 2025, 4:52.</w:t>
+            </w:r>
+          </w:p>
+        </w:tc>
+        <w:tc>
+          <w:tcPr>
+            <w:tcW w:type="dxa" w:w="2376"/>
+          </w:tcPr>
+          <w:p>
+            <w:pPr>
+              <w:spacing w:after="40"/>
+            </w:pPr>
+            <w:r>
+              <w:rPr>
+                <w:sz w:val="19"/>
+              </w:rPr>
+              <w:t>0:42–0:58 "Didn't tell anybody" BUTT 2:10–2:21 "what was happening"</w:t>
+            </w:r>
+          </w:p>
+        </w:tc>
+        <w:tc>
+          <w:tcPr>
+            <w:tcW w:type="dxa" w:w="1368"/>
+          </w:tcPr>
+          <w:p>
+            <w:pPr>
+              <w:spacing w:after="40"/>
+            </w:pPr>
+            <w:r>
+              <w:rPr>
+                <w:sz w:val="19"/>
+              </w:rPr>
+              <w:t>PICK</w:t>
+            </w:r>
+          </w:p>
+        </w:tc>
+      </w:tr>
+      <w:tr>
+        <w:tc>
+          <w:tcPr>
+            <w:tcW w:type="dxa" w:w="432"/>
+          </w:tcPr>
+          <w:p>
+            <w:pPr>
+              <w:spacing w:after="40"/>
+            </w:pPr>
+            <w:r>
+              <w:rPr>
+                <w:sz w:val="19"/>
+              </w:rPr>
+              <w:t>3</w:t>
+            </w:r>
+          </w:p>
+        </w:tc>
+        <w:tc>
+          <w:tcPr>
+            <w:tcW w:type="dxa" w:w="2664"/>
+          </w:tcPr>
+          <w:p>
+            <w:pPr>
+              <w:spacing w:after="40"/>
+            </w:pPr>
+            <w:hyperlink r:id="rId10">
+              <w:r>
+                <w:rPr>
+                  <w:color w:val="1155CC"/>
+                  <w:u w:val="single"/>
+                </w:rPr>
+                <w:t xml:space="preserve">ABC15 — Valley senior spends $25,000 on beauty products</w:t>
+              </w:r>
+            </w:hyperlink>
+          </w:p>
+        </w:tc>
+        <w:tc>
+          <w:tcPr>
+            <w:tcW w:type="dxa" w:w="3096"/>
+          </w:tcPr>
+          <w:p>
+            <w:pPr>
+              <w:spacing w:after="40"/>
+            </w:pPr>
+            <w:r>
+              <w:rPr>
+                <w:sz w:val="19"/>
+              </w:rPr>
+              <w:t>Lettie, 79: free facials as lures, "pressured, pressured, pressured," said no 50 to 60 times; $25,000 on Social Security. 4:02.</w:t>
+            </w:r>
+          </w:p>
+        </w:tc>
+        <w:tc>
+          <w:tcPr>
+            <w:tcW w:type="dxa" w:w="2376"/>
+          </w:tcPr>
+          <w:p>
+            <w:pPr>
+              <w:spacing w:after="40"/>
+            </w:pPr>
+            <w:r>
+              <w:rPr>
+                <w:sz w:val="19"/>
+              </w:rPr>
+              <w:t>1:09–1:37 "times, at least" BUTT 1:52–2:09 "I'm ashamed"</w:t>
+            </w:r>
+          </w:p>
+        </w:tc>
+        <w:tc>
+          <w:tcPr>
+            <w:tcW w:type="dxa" w:w="1368"/>
+          </w:tcPr>
+          <w:p>
+            <w:pPr>
+              <w:spacing w:after="40"/>
+            </w:pPr>
+            <w:r>
+              <w:rPr>
+                <w:sz w:val="19"/>
+              </w:rPr>
+              <w:t>PICK</w:t>
+            </w:r>
+          </w:p>
+        </w:tc>
+      </w:tr>
+      <w:tr>
+        <w:tc>
+          <w:tcPr>
+            <w:tcW w:type="dxa" w:w="432"/>
+          </w:tcPr>
+          <w:p>
+            <w:pPr>
+              <w:spacing w:after="40"/>
+            </w:pPr>
+            <w:r>
+              <w:rPr>
+                <w:sz w:val="19"/>
+              </w:rPr>
+              <w:t>4</w:t>
+            </w:r>
+          </w:p>
+        </w:tc>
+        <w:tc>
+          <w:tcPr>
+            <w:tcW w:type="dxa" w:w="2664"/>
+          </w:tcPr>
+          <w:p>
+            <w:pPr>
+              <w:spacing w:after="40"/>
+            </w:pPr>
+            <w:hyperlink r:id="rId11">
+              <w:r>
+                <w:rPr>
+                  <w:color w:val="1155CC"/>
+                  <w:u w:val="single"/>
+                </w:rPr>
+                <w:t xml:space="preserve">CBS LA — Bee &amp; Co. accused of coercive sales after man spends $50K</w:t>
+              </w:r>
+            </w:hyperlink>
+          </w:p>
+        </w:tc>
+        <w:tc>
+          <w:tcPr>
+            <w:tcW w:type="dxa" w:w="3096"/>
+          </w:tcPr>
+          <w:p>
+            <w:pPr>
+              <w:spacing w:after="40"/>
+            </w:pPr>
+            <w:r>
+              <w:rPr>
+                <w:sz w:val="19"/>
+              </w:rPr>
+              <w:t>Chisholm, 30: account drained from $80,000 to under $500; $40,000+ to Bee &amp; Co. Uploaded Aug 27, 2026, 5:03.</w:t>
+            </w:r>
+          </w:p>
+        </w:tc>
+        <w:tc>
+          <w:tcPr>
+            <w:tcW w:type="dxa" w:w="2376"/>
+          </w:tcPr>
+          <w:p>
+            <w:pPr>
+              <w:spacing w:after="40"/>
+            </w:pPr>
+            <w:r>
+              <w:rPr>
+                <w:sz w:val="19"/>
+              </w:rPr>
+              <w:t>0:18–0:53 "in separate transactions" BUTT 1:03–1:26 "Uh no, I did not"</w:t>
+            </w:r>
+          </w:p>
+        </w:tc>
+        <w:tc>
+          <w:tcPr>
+            <w:tcW w:type="dxa" w:w="1368"/>
+          </w:tcPr>
+          <w:p>
+            <w:pPr>
+              <w:spacing w:after="40"/>
+            </w:pPr>
+            <w:r>
+              <w:rPr>
+                <w:sz w:val="19"/>
+              </w:rPr>
+              <w:t>PICK</w:t>
+            </w:r>
+          </w:p>
+        </w:tc>
+      </w:tr>
+      <w:tr>
+        <w:tc>
+          <w:tcPr>
+            <w:tcW w:type="dxa" w:w="432"/>
+          </w:tcPr>
+          <w:p>
+            <w:pPr>
+              <w:spacing w:after="40"/>
+            </w:pPr>
+            <w:r>
+              <w:rPr>
+                <w:sz w:val="19"/>
+              </w:rPr>
+              <w:t>5</w:t>
+            </w:r>
+          </w:p>
+        </w:tc>
+        <w:tc>
+          <w:tcPr>
+            <w:tcW w:type="dxa" w:w="2664"/>
+          </w:tcPr>
+          <w:p>
+            <w:pPr>
+              <w:spacing w:after="40"/>
+            </w:pPr>
+            <w:hyperlink r:id="rId12">
+              <w:r>
+                <w:rPr>
+                  <w:color w:val="1155CC"/>
+                  <w:u w:val="single"/>
+                </w:rPr>
+                <w:t xml:space="preserve">CBS LA — Bee &amp; Co. faces new allegations of coercive sales</w:t>
+              </w:r>
+            </w:hyperlink>
+          </w:p>
+        </w:tc>
+        <w:tc>
+          <w:tcPr>
+            <w:tcW w:type="dxa" w:w="3096"/>
+          </w:tcPr>
+          <w:p>
+            <w:pPr>
+              <w:spacing w:after="40"/>
+            </w:pPr>
+            <w:r>
+              <w:rPr>
+                <w:sz w:val="19"/>
+              </w:rPr>
+              <w:t>Rep. Sherman to take it to AG Bonta; two women in their 80s and small-claims settlements. Uploaded Sept 23, 2026, 6:15.</w:t>
+            </w:r>
+          </w:p>
+        </w:tc>
+        <w:tc>
+          <w:tcPr>
+            <w:tcW w:type="dxa" w:w="2376"/>
+          </w:tcPr>
+          <w:p>
+            <w:pPr>
+              <w:spacing w:after="40"/>
+            </w:pPr>
+            <w:r>
+              <w:rPr>
+                <w:sz w:val="19"/>
+              </w:rPr>
+              <w:t>2:04–2:37 "our state attorney general" BUTT 4:41–5:09 "independently operated tenant"</w:t>
+            </w:r>
+          </w:p>
+        </w:tc>
+        <w:tc>
+          <w:tcPr>
+            <w:tcW w:type="dxa" w:w="1368"/>
+          </w:tcPr>
+          <w:p>
+            <w:pPr>
+              <w:spacing w:after="40"/>
+            </w:pPr>
+            <w:r>
+              <w:rPr>
+                <w:sz w:val="19"/>
+              </w:rPr>
+              <w:t>PICK</w:t>
+            </w:r>
+          </w:p>
+        </w:tc>
+      </w:tr>
+      <w:tr>
+        <w:tc>
+          <w:tcPr>
+            <w:tcW w:type="dxa" w:w="432"/>
+          </w:tcPr>
+          <w:p>
+            <w:pPr>
+              <w:spacing w:after="40"/>
+            </w:pPr>
+            <w:r>
+              <w:rPr>
+                <w:sz w:val="19"/>
+              </w:rPr>
+              <w:t>6</w:t>
+            </w:r>
+          </w:p>
+        </w:tc>
+        <w:tc>
+          <w:tcPr>
+            <w:tcW w:type="dxa" w:w="2664"/>
+          </w:tcPr>
+          <w:p>
+            <w:pPr>
+              <w:spacing w:after="40"/>
+            </w:pPr>
+            <w:hyperlink r:id="rId13">
+              <w:r>
+                <w:rPr>
+                  <w:color w:val="1155CC"/>
+                  <w:u w:val="single"/>
+                </w:rPr>
+                <w:t xml:space="preserve">CBS LA — Bee &amp; Co. skincare store closes</w:t>
+              </w:r>
+            </w:hyperlink>
+          </w:p>
+        </w:tc>
+        <w:tc>
+          <w:tcPr>
+            <w:tcW w:type="dxa" w:w="3096"/>
+          </w:tcPr>
+          <w:p>
+            <w:pPr>
+              <w:spacing w:after="40"/>
+            </w:pPr>
+            <w:r>
+              <w:rPr>
+                <w:sz w:val="19"/>
+              </w:rPr>
+              <w:t>The deserted storefront and lockbox; then the company lawyer's letter calling coverage one-sided. Uploaded Oct 1, 2026, 4:04.</w:t>
+            </w:r>
+          </w:p>
+        </w:tc>
+        <w:tc>
+          <w:tcPr>
+            <w:tcW w:type="dxa" w:w="2376"/>
+          </w:tcPr>
+          <w:p>
+            <w:pPr>
+              <w:spacing w:after="40"/>
+            </w:pPr>
+            <w:r>
+              <w:rPr>
+                <w:sz w:val="19"/>
+              </w:rPr>
+              <w:t>0:22–0:33 "the B and Co name remains" BUTT 3:03–3:27 "making large purchases at multiple stores"</w:t>
+            </w:r>
+          </w:p>
+        </w:tc>
+        <w:tc>
+          <w:tcPr>
+            <w:tcW w:type="dxa" w:w="1368"/>
+          </w:tcPr>
+          <w:p>
+            <w:pPr>
+              <w:spacing w:after="40"/>
+            </w:pPr>
+            <w:r>
+              <w:rPr>
+                <w:sz w:val="19"/>
+              </w:rPr>
+              <w:t>PICK</w:t>
+            </w:r>
+          </w:p>
+        </w:tc>
+      </w:tr>
+      <w:tr>
+        <w:tc>
+          <w:tcPr>
+            <w:tcW w:type="dxa" w:w="432"/>
+          </w:tcPr>
+          <w:p>
+            <w:pPr>
+              <w:spacing w:after="40"/>
+            </w:pPr>
+            <w:r>
+              <w:rPr>
+                <w:sz w:val="19"/>
+              </w:rPr>
+              <w:t>7</w:t>
+            </w:r>
+          </w:p>
+        </w:tc>
+        <w:tc>
+          <w:tcPr>
+            <w:tcW w:type="dxa" w:w="2664"/>
+          </w:tcPr>
+          <w:p>
+            <w:pPr>
+              <w:spacing w:after="40"/>
+            </w:pPr>
+            <w:hyperlink r:id="rId14">
+              <w:r>
+                <w:rPr>
+                  <w:color w:val="1155CC"/>
+                  <w:u w:val="single"/>
+                </w:rPr>
+                <w:t xml:space="preserve">KOIN 6 — Bank teller saves woman from $50K skin care "trance"</w:t>
+              </w:r>
+            </w:hyperlink>
+          </w:p>
+        </w:tc>
+        <w:tc>
+          <w:tcPr>
+            <w:tcW w:type="dxa" w:w="3096"/>
+          </w:tcPr>
+          <w:p>
+            <w:pPr>
+              <w:spacing w:after="40"/>
+            </w:pPr>
+            <w:r>
+              <w:rPr>
+                <w:sz w:val="19"/>
+              </w:rPr>
+              <w:t>Donna, 75, lured by eye cream at a kiosk; the owner drives her to a bank for $50,000; a teller stops it. 6:46.</w:t>
+            </w:r>
+          </w:p>
+        </w:tc>
+        <w:tc>
+          <w:tcPr>
+            <w:tcW w:type="dxa" w:w="2376"/>
+          </w:tcPr>
+          <w:p>
+            <w:pPr>
+              <w:spacing w:after="40"/>
+            </w:pPr>
+            <w:r>
+              <w:rPr>
+                <w:sz w:val="19"/>
+              </w:rPr>
+              <w:t>0:32–0:48 "bh28 skincare consultants" BUTT 2:22–3:11 "bank teller called police"</w:t>
+            </w:r>
+          </w:p>
+        </w:tc>
+        <w:tc>
+          <w:tcPr>
+            <w:tcW w:type="dxa" w:w="1368"/>
+          </w:tcPr>
+          <w:p>
+            <w:pPr>
+              <w:spacing w:after="40"/>
+            </w:pPr>
+            <w:r>
+              <w:rPr>
+                <w:sz w:val="19"/>
+              </w:rPr>
+              <w:t>PICK</w:t>
+            </w:r>
+          </w:p>
+        </w:tc>
+      </w:tr>
+    </w:tbl>
+    <w:p/>
+    <w:p>
+      <w:pPr>
+        <w:pStyle w:val="Heading3"/>
+      </w:pPr>
+      <w:r>
+        <w:rPr>
+          <w:color w:val="333333"/>
+          <w:sz w:val="22"/>
+        </w:rPr>
         <w:t>The fix</w:t>
       </w:r>
     </w:p>
@@ -1569,7 +2216,7 @@
         <w:spacing w:after="40"/>
       </w:pPr>
       <w:r>
-        <w:t>⚠️ Beat 2 is from June 2025, and Taylor's "Bee and Co" isn't tied to Mazal's Bee &amp; Co. by any source.</w:t>
+        <w:t>⚠️ Beat 2 is from June 2025 (purchase about early 2024). Her store's site calls every Bee and Co "independently owned"; don't tie it to Mazal's Bee &amp; Co.</w:t>
       </w:r>
     </w:p>
     <w:p>
@@ -1587,7 +2234,16 @@
         <w:spacing w:after="40"/>
       </w:pPr>
       <w:r>
-        <w:t>⚠️ Georgia, from the original pitch: no case found. Don't say it.</w:t>
+        <w:t>⚠️ Georgia: a 74-year-old Georgia woman was charged $8,000+ at the Florida store (First Coast News, citing police). A Georgia victim, not a Georgia store.</w:t>
+      </w:r>
+    </w:p>
+    <w:p>
+      <w:pPr>
+        <w:pStyle w:val="ListBullet"/>
+        <w:spacing w:after="40"/>
+      </w:pPr>
+      <w:r>
+        <w:t>⚠️ Beat 7: Donna asked not to show her face.</w:t>
       </w:r>
     </w:p>
     <w:p>
@@ -1615,7 +2271,7 @@
         <w:t>In one sentence:</w:t>
       </w:r>
       <w:r>
-        <w:t xml:space="preserve"> A caregiver became a 75-year-old's power of attorney, deeded his house to herself for $5, told his daughter through the doorbell that he had died, and was arrested Sept 28.</w:t>
+        <w:t xml:space="preserve"> A daughter rang her father's doorbell and his caregiver answered that he had died; the caregiver had become his power of attorney, deeded his house to herself for $5, and was arrested Sept 28.</w:t>
       </w:r>
     </w:p>
     <w:p>
@@ -1756,7 +2412,7 @@
               <w:rPr>
                 <w:sz w:val="19"/>
               </w:rPr>
-              <w:t>The $5 deed</w:t>
+              <w:t>The doorbell</w:t>
             </w:r>
           </w:p>
         </w:tc>
@@ -1772,7 +2428,7 @@
               <w:rPr>
                 <w:sz w:val="19"/>
               </w:rPr>
-              <w:t>Robert Rowland, 75, Conway, South Carolina</w:t>
+              <w:t>Nora Rowland, his daughter</w:t>
             </w:r>
           </w:p>
         </w:tc>
@@ -1788,7 +2444,7 @@
               <w:rPr>
                 <w:sz w:val="19"/>
               </w:rPr>
-              <w:t>His caregiver becomes his power of attorney, then a quitclaim deed moves his house to her for $5.</w:t>
+              <w:t>She rings her father's Ring doorbell; the caregiver answers that he died, and police handcuff Nora as the trespasser.</w:t>
             </w:r>
           </w:p>
         </w:tc>
@@ -1838,7 +2494,7 @@
               <w:rPr>
                 <w:sz w:val="19"/>
               </w:rPr>
-              <w:t>The doorbell</w:t>
+              <w:t>The $5 deed</w:t>
             </w:r>
           </w:p>
         </w:tc>
@@ -1854,7 +2510,7 @@
               <w:rPr>
                 <w:sz w:val="19"/>
               </w:rPr>
-              <w:t>Nora Rowland, his daughter</w:t>
+              <w:t>Robert Rowland, 75, Conway, South Carolina</w:t>
             </w:r>
           </w:p>
         </w:tc>
@@ -1870,7 +2526,7 @@
               <w:rPr>
                 <w:sz w:val="19"/>
               </w:rPr>
-              <w:t>She rings the Ring doorbell; the caregiver says he died three days earlier, and police treat Nora as the trespasser.</w:t>
+              <w:t>His caregiver becomes his power of attorney, then a quitclaim deed moves his house to her for $5.</w:t>
             </w:r>
           </w:p>
         </w:tc>
@@ -1886,7 +2542,7 @@
               <w:rPr>
                 <w:sz w:val="19"/>
               </w:rPr>
-              <w:t>HAVE · HORIZONTAL — Inside Edition</w:t>
+              <w:t>HAVE · HORIZONTAL — WMBF original</w:t>
             </w:r>
           </w:p>
         </w:tc>
@@ -2066,6 +2722,362 @@
           <w:color w:val="333333"/>
           <w:sz w:val="22"/>
         </w:rPr>
+        <w:t>Videos</w:t>
+      </w:r>
+    </w:p>
+    <w:tbl>
+      <w:tblPr>
+        <w:tblStyle w:val="TableGrid"/>
+        <w:tblW w:type="auto" w:w="0"/>
+        <w:jc w:val="center"/>
+        <w:tblLayout w:type="fixed"/>
+        <w:tblLook w:firstColumn="1" w:firstRow="1" w:lastColumn="0" w:lastRow="0" w:noHBand="0" w:noVBand="1" w:val="04A0"/>
+      </w:tblPr>
+      <w:tblGrid>
+        <w:gridCol w:w="432"/>
+        <w:gridCol w:w="2664"/>
+        <w:gridCol w:w="3096"/>
+        <w:gridCol w:w="2376"/>
+        <w:gridCol w:w="1368"/>
+      </w:tblGrid>
+      <w:tr>
+        <w:tc>
+          <w:tcPr>
+            <w:tcW w:type="dxa" w:w="432"/>
+          </w:tcPr>
+          <w:p>
+            <w:r>
+              <w:rPr>
+                <w:b/>
+                <w:sz w:val="19"/>
+              </w:rPr>
+              <w:t>#</w:t>
+            </w:r>
+          </w:p>
+        </w:tc>
+        <w:tc>
+          <w:tcPr>
+            <w:tcW w:type="dxa" w:w="2664"/>
+          </w:tcPr>
+          <w:p>
+            <w:r>
+              <w:rPr>
+                <w:b/>
+                <w:sz w:val="19"/>
+              </w:rPr>
+              <w:t>Clip</w:t>
+            </w:r>
+          </w:p>
+        </w:tc>
+        <w:tc>
+          <w:tcPr>
+            <w:tcW w:type="dxa" w:w="3096"/>
+          </w:tcPr>
+          <w:p>
+            <w:r>
+              <w:rPr>
+                <w:b/>
+                <w:sz w:val="19"/>
+              </w:rPr>
+              <w:t>Shows</w:t>
+            </w:r>
+          </w:p>
+        </w:tc>
+        <w:tc>
+          <w:tcPr>
+            <w:tcW w:type="dxa" w:w="2376"/>
+          </w:tcPr>
+          <w:p>
+            <w:r>
+              <w:rPr>
+                <w:b/>
+                <w:sz w:val="19"/>
+              </w:rPr>
+              <w:t>In–Out</w:t>
+            </w:r>
+          </w:p>
+        </w:tc>
+        <w:tc>
+          <w:tcPr>
+            <w:tcW w:type="dxa" w:w="1368"/>
+          </w:tcPr>
+          <w:p>
+            <w:r>
+              <w:rPr>
+                <w:b/>
+                <w:sz w:val="19"/>
+              </w:rPr>
+              <w:t>Status</w:t>
+            </w:r>
+          </w:p>
+        </w:tc>
+      </w:tr>
+      <w:tr>
+        <w:tc>
+          <w:tcPr>
+            <w:tcW w:type="dxa" w:w="432"/>
+          </w:tcPr>
+          <w:p>
+            <w:pPr>
+              <w:spacing w:after="40"/>
+            </w:pPr>
+            <w:r>
+              <w:rPr>
+                <w:sz w:val="19"/>
+              </w:rPr>
+              <w:t>1</w:t>
+            </w:r>
+          </w:p>
+        </w:tc>
+        <w:tc>
+          <w:tcPr>
+            <w:tcW w:type="dxa" w:w="2664"/>
+          </w:tcPr>
+          <w:p>
+            <w:pPr>
+              <w:spacing w:after="40"/>
+            </w:pPr>
+            <w:hyperlink r:id="rId15">
+              <w:r>
+                <w:rPr>
+                  <w:color w:val="1155CC"/>
+                  <w:u w:val="single"/>
+                </w:rPr>
+                <w:t xml:space="preserve">WSMV 4 Nashville (repost of WMBF) — Caregiver took deed to her father's home</w:t>
+              </w:r>
+            </w:hyperlink>
+          </w:p>
+        </w:tc>
+        <w:tc>
+          <w:tcPr>
+            <w:tcW w:type="dxa" w:w="3096"/>
+          </w:tcPr>
+          <w:p>
+            <w:pPr>
+              <w:spacing w:after="40"/>
+            </w:pPr>
+            <w:r>
+              <w:rPr>
+                <w:sz w:val="19"/>
+              </w:rPr>
+              <w:t>Nora retells the doorbell call ("your dad died"), her phone video of the confrontation ("I GOT A DEED"), then handcuffs. 5.68M, Aug 30, 2026, 2:23.</w:t>
+            </w:r>
+          </w:p>
+        </w:tc>
+        <w:tc>
+          <w:tcPr>
+            <w:tcW w:type="dxa" w:w="2376"/>
+          </w:tcPr>
+          <w:p>
+            <w:pPr>
+              <w:spacing w:after="40"/>
+            </w:pPr>
+            <w:r>
+              <w:rPr>
+                <w:sz w:val="19"/>
+              </w:rPr>
+              <w:t>0:39–1:11 "dead for 3 days" BUTT 1:43–2:22 "this is my dad's house"</w:t>
+            </w:r>
+          </w:p>
+        </w:tc>
+        <w:tc>
+          <w:tcPr>
+            <w:tcW w:type="dxa" w:w="1368"/>
+          </w:tcPr>
+          <w:p>
+            <w:pPr>
+              <w:spacing w:after="40"/>
+            </w:pPr>
+            <w:r>
+              <w:rPr>
+                <w:sz w:val="19"/>
+              </w:rPr>
+              <w:t>PICK</w:t>
+            </w:r>
+          </w:p>
+        </w:tc>
+      </w:tr>
+      <w:tr>
+        <w:tc>
+          <w:tcPr>
+            <w:tcW w:type="dxa" w:w="432"/>
+          </w:tcPr>
+          <w:p>
+            <w:pPr>
+              <w:spacing w:after="40"/>
+            </w:pPr>
+            <w:r>
+              <w:rPr>
+                <w:sz w:val="19"/>
+              </w:rPr>
+              <w:t>2</w:t>
+            </w:r>
+          </w:p>
+        </w:tc>
+        <w:tc>
+          <w:tcPr>
+            <w:tcW w:type="dxa" w:w="2664"/>
+          </w:tcPr>
+          <w:p>
+            <w:pPr>
+              <w:spacing w:after="40"/>
+            </w:pPr>
+            <w:hyperlink r:id="rId16">
+              <w:r>
+                <w:rPr>
+                  <w:color w:val="1155CC"/>
+                  <w:u w:val="single"/>
+                </w:rPr>
+                <w:t xml:space="preserve">WMBF News — Daughter claims caregiver took deed to father's Conway home</w:t>
+              </w:r>
+            </w:hyperlink>
+          </w:p>
+        </w:tc>
+        <w:tc>
+          <w:tcPr>
+            <w:tcW w:type="dxa" w:w="3096"/>
+          </w:tcPr>
+          <w:p>
+            <w:pPr>
+              <w:spacing w:after="40"/>
+            </w:pPr>
+            <w:r>
+              <w:rPr>
+                <w:sz w:val="19"/>
+              </w:rPr>
+              <w:t>The paper trail: home care in March 2024, power of attorney in April, the $5 quitclaim deed April 17, transfers after his death. 129K, 4:47.</w:t>
+            </w:r>
+          </w:p>
+        </w:tc>
+        <w:tc>
+          <w:tcPr>
+            <w:tcW w:type="dxa" w:w="2376"/>
+          </w:tcPr>
+          <w:p>
+            <w:pPr>
+              <w:spacing w:after="40"/>
+            </w:pPr>
+            <w:r>
+              <w:rPr>
+                <w:sz w:val="19"/>
+              </w:rPr>
+              <w:t>3:10–3:38 "even after he died"</w:t>
+            </w:r>
+          </w:p>
+        </w:tc>
+        <w:tc>
+          <w:tcPr>
+            <w:tcW w:type="dxa" w:w="1368"/>
+          </w:tcPr>
+          <w:p>
+            <w:pPr>
+              <w:spacing w:after="40"/>
+            </w:pPr>
+            <w:r>
+              <w:rPr>
+                <w:sz w:val="19"/>
+              </w:rPr>
+              <w:t>PICK</w:t>
+            </w:r>
+          </w:p>
+        </w:tc>
+      </w:tr>
+      <w:tr>
+        <w:tc>
+          <w:tcPr>
+            <w:tcW w:type="dxa" w:w="432"/>
+          </w:tcPr>
+          <w:p>
+            <w:pPr>
+              <w:spacing w:after="40"/>
+            </w:pPr>
+            <w:r>
+              <w:rPr>
+                <w:sz w:val="19"/>
+              </w:rPr>
+              <w:t>3</w:t>
+            </w:r>
+          </w:p>
+        </w:tc>
+        <w:tc>
+          <w:tcPr>
+            <w:tcW w:type="dxa" w:w="2664"/>
+          </w:tcPr>
+          <w:p>
+            <w:pPr>
+              <w:spacing w:after="40"/>
+            </w:pPr>
+            <w:hyperlink r:id="rId17">
+              <w:r>
+                <w:rPr>
+                  <w:color w:val="1155CC"/>
+                  <w:u w:val="single"/>
+                </w:rPr>
+                <w:t xml:space="preserve">WMBF News — Daughter reacts after caregiver is arrested</w:t>
+              </w:r>
+            </w:hyperlink>
+          </w:p>
+        </w:tc>
+        <w:tc>
+          <w:tcPr>
+            <w:tcW w:type="dxa" w:w="3096"/>
+          </w:tcPr>
+          <w:p>
+            <w:pPr>
+              <w:spacing w:after="40"/>
+            </w:pPr>
+            <w:r>
+              <w:rPr>
+                <w:sz w:val="19"/>
+              </w:rPr>
+              <w:t>Sept 28 arrest: perjury, breach of trust, exploitation of a vulnerable adult; Nora "relieved." Sept 30, 2026, 3:15.</w:t>
+            </w:r>
+          </w:p>
+        </w:tc>
+        <w:tc>
+          <w:tcPr>
+            <w:tcW w:type="dxa" w:w="2376"/>
+          </w:tcPr>
+          <w:p>
+            <w:pPr>
+              <w:spacing w:after="40"/>
+            </w:pPr>
+            <w:r>
+              <w:rPr>
+                <w:sz w:val="19"/>
+              </w:rPr>
+              <w:t>0:59–1:27 "I was relieved"</w:t>
+            </w:r>
+          </w:p>
+        </w:tc>
+        <w:tc>
+          <w:tcPr>
+            <w:tcW w:type="dxa" w:w="1368"/>
+          </w:tcPr>
+          <w:p>
+            <w:pPr>
+              <w:spacing w:after="40"/>
+            </w:pPr>
+            <w:r>
+              <w:rPr>
+                <w:sz w:val="19"/>
+              </w:rPr>
+              <w:t>PICK</w:t>
+            </w:r>
+          </w:p>
+        </w:tc>
+      </w:tr>
+    </w:tbl>
+    <w:p/>
+    <w:p>
+      <w:pPr>
+        <w:pStyle w:val="Heading3"/>
+      </w:pPr>
+      <w:r>
+        <w:rPr>
+          <w:color w:val="333333"/>
+          <w:sz w:val="22"/>
+        </w:rPr>
         <w:t>The fix</w:t>
       </w:r>
     </w:p>
@@ -2114,7 +3126,7 @@
         <w:spacing w:after="40"/>
       </w:pPr>
       <w:r>
-        <w:t>⚠️ Beat 1: the 5.7M Short is WSMV's repost of WMBF's story. Clear it through Gray.</w:t>
+        <w:t>⚠️ Beat 1: the 5.7M Short is WSMV's repost of WMBF's story. Clear it through Gray. Inside Edition (275K) is the horizontal alternate.</w:t>
       </w:r>
     </w:p>
     <w:p>
@@ -2123,7 +3135,7 @@
         <w:spacing w:after="40"/>
       </w:pPr>
       <w:r>
-        <w:t>⚠️ Beat 2: "Your dad died" is a paraphrase; sources say "had died three days earlier."</w:t>
+        <w:t>⚠️ Inside Edition says Robert was 74; WMBF and court records say 75.</w:t>
       </w:r>
     </w:p>
     <w:p>
@@ -2160,7 +3172,7 @@
         <w:t>In one sentence:</w:t>
       </w:r>
       <w:r>
-        <w:t xml:space="preserve"> A fake AI video tells seniors Congress froze their property taxes and pushes a form that doesn't exist, and the phone number reaches scammers who want your Social Security number.</w:t>
+        <w:t xml:space="preserve"> A fake AI video tells seniors Congress froze their property taxes and pushes a form that doesn't exist; Wisconsin officials say the phone number reaches scammers who want your Social Security number.</w:t>
       </w:r>
     </w:p>
     <w:p>
@@ -2399,7 +3411,7 @@
               <w:rPr>
                 <w:sz w:val="19"/>
               </w:rPr>
-              <w:t>David Casey, Wisconsin revenue secretary, and county auditors</w:t>
+              <w:t>Douglas County, Colorado assessor; Wisconsin revenue secretary David Casey</w:t>
             </w:r>
           </w:p>
         </w:tc>
@@ -2415,7 +3427,7 @@
               <w:rPr>
                 <w:sz w:val="19"/>
               </w:rPr>
-              <w:t>Officials say no such law or form exists, and the number in the video goes to scammers.</w:t>
+              <w:t>Seniors call assessors asking for a form that doesn't exist; officials say no such federal program exists.</w:t>
             </w:r>
           </w:p>
         </w:tc>
@@ -2529,6 +3541,277 @@
           <w:color w:val="333333"/>
           <w:sz w:val="22"/>
         </w:rPr>
+        <w:t>Videos</w:t>
+      </w:r>
+    </w:p>
+    <w:tbl>
+      <w:tblPr>
+        <w:tblStyle w:val="TableGrid"/>
+        <w:tblW w:type="auto" w:w="0"/>
+        <w:jc w:val="center"/>
+        <w:tblLayout w:type="fixed"/>
+        <w:tblLook w:firstColumn="1" w:firstRow="1" w:lastColumn="0" w:lastRow="0" w:noHBand="0" w:noVBand="1" w:val="04A0"/>
+      </w:tblPr>
+      <w:tblGrid>
+        <w:gridCol w:w="432"/>
+        <w:gridCol w:w="2664"/>
+        <w:gridCol w:w="3096"/>
+        <w:gridCol w:w="2376"/>
+        <w:gridCol w:w="1368"/>
+      </w:tblGrid>
+      <w:tr>
+        <w:tc>
+          <w:tcPr>
+            <w:tcW w:type="dxa" w:w="432"/>
+          </w:tcPr>
+          <w:p>
+            <w:r>
+              <w:rPr>
+                <w:b/>
+                <w:sz w:val="19"/>
+              </w:rPr>
+              <w:t>#</w:t>
+            </w:r>
+          </w:p>
+        </w:tc>
+        <w:tc>
+          <w:tcPr>
+            <w:tcW w:type="dxa" w:w="2664"/>
+          </w:tcPr>
+          <w:p>
+            <w:r>
+              <w:rPr>
+                <w:b/>
+                <w:sz w:val="19"/>
+              </w:rPr>
+              <w:t>Clip</w:t>
+            </w:r>
+          </w:p>
+        </w:tc>
+        <w:tc>
+          <w:tcPr>
+            <w:tcW w:type="dxa" w:w="3096"/>
+          </w:tcPr>
+          <w:p>
+            <w:r>
+              <w:rPr>
+                <w:b/>
+                <w:sz w:val="19"/>
+              </w:rPr>
+              <w:t>Shows</w:t>
+            </w:r>
+          </w:p>
+        </w:tc>
+        <w:tc>
+          <w:tcPr>
+            <w:tcW w:type="dxa" w:w="2376"/>
+          </w:tcPr>
+          <w:p>
+            <w:r>
+              <w:rPr>
+                <w:b/>
+                <w:sz w:val="19"/>
+              </w:rPr>
+              <w:t>In–Out</w:t>
+            </w:r>
+          </w:p>
+        </w:tc>
+        <w:tc>
+          <w:tcPr>
+            <w:tcW w:type="dxa" w:w="1368"/>
+          </w:tcPr>
+          <w:p>
+            <w:r>
+              <w:rPr>
+                <w:b/>
+                <w:sz w:val="19"/>
+              </w:rPr>
+              <w:t>Status</w:t>
+            </w:r>
+          </w:p>
+        </w:tc>
+      </w:tr>
+      <w:tr>
+        <w:tc>
+          <w:tcPr>
+            <w:tcW w:type="dxa" w:w="432"/>
+          </w:tcPr>
+          <w:p>
+            <w:pPr>
+              <w:spacing w:after="40"/>
+            </w:pPr>
+            <w:r>
+              <w:rPr>
+                <w:sz w:val="19"/>
+              </w:rPr>
+              <w:t>1</w:t>
+            </w:r>
+          </w:p>
+        </w:tc>
+        <w:tc>
+          <w:tcPr>
+            <w:tcW w:type="dxa" w:w="2664"/>
+          </w:tcPr>
+          <w:p>
+            <w:pPr>
+              <w:spacing w:after="40"/>
+            </w:pPr>
+            <w:hyperlink r:id="rId18">
+              <w:r>
+                <w:rPr>
+                  <w:color w:val="1155CC"/>
+                  <w:u w:val="single"/>
+                </w:rPr>
+                <w:t xml:space="preserve">Denver7 — Assessor warns about viral AI property tax scam</w:t>
+              </w:r>
+            </w:hyperlink>
+          </w:p>
+        </w:tc>
+        <w:tc>
+          <w:tcPr>
+            <w:tcW w:type="dxa" w:w="3096"/>
+          </w:tcPr>
+          <w:p>
+            <w:pPr>
+              <w:spacing w:after="40"/>
+            </w:pPr>
+            <w:r>
+              <w:rPr>
+                <w:sz w:val="19"/>
+              </w:rPr>
+              <w:t>Plays the fake AI video ("The programs are real. The savings are real…"), then "the person in the video is not real either." Aug 8, 2026, 1:34.</w:t>
+            </w:r>
+          </w:p>
+        </w:tc>
+        <w:tc>
+          <w:tcPr>
+            <w:tcW w:type="dxa" w:w="2376"/>
+          </w:tcPr>
+          <w:p>
+            <w:pPr>
+              <w:spacing w:after="40"/>
+            </w:pPr>
+            <w:r>
+              <w:rPr>
+                <w:sz w:val="19"/>
+              </w:rPr>
+              <w:t>0:12–0:27 "It's completely AI"</w:t>
+            </w:r>
+          </w:p>
+        </w:tc>
+        <w:tc>
+          <w:tcPr>
+            <w:tcW w:type="dxa" w:w="1368"/>
+          </w:tcPr>
+          <w:p>
+            <w:pPr>
+              <w:spacing w:after="40"/>
+            </w:pPr>
+            <w:r>
+              <w:rPr>
+                <w:sz w:val="19"/>
+              </w:rPr>
+              <w:t>PICK</w:t>
+            </w:r>
+          </w:p>
+        </w:tc>
+      </w:tr>
+      <w:tr>
+        <w:tc>
+          <w:tcPr>
+            <w:tcW w:type="dxa" w:w="432"/>
+          </w:tcPr>
+          <w:p>
+            <w:pPr>
+              <w:spacing w:after="40"/>
+            </w:pPr>
+            <w:r>
+              <w:rPr>
+                <w:sz w:val="19"/>
+              </w:rPr>
+              <w:t>2</w:t>
+            </w:r>
+          </w:p>
+        </w:tc>
+        <w:tc>
+          <w:tcPr>
+            <w:tcW w:type="dxa" w:w="2664"/>
+          </w:tcPr>
+          <w:p>
+            <w:pPr>
+              <w:spacing w:after="40"/>
+            </w:pPr>
+            <w:hyperlink r:id="rId18">
+              <w:r>
+                <w:rPr>
+                  <w:color w:val="1155CC"/>
+                  <w:u w:val="single"/>
+                </w:rPr>
+                <w:t xml:space="preserve">Denver7 — Assessor warns about viral AI property tax scam</w:t>
+              </w:r>
+            </w:hyperlink>
+          </w:p>
+        </w:tc>
+        <w:tc>
+          <w:tcPr>
+            <w:tcW w:type="dxa" w:w="3096"/>
+          </w:tcPr>
+          <w:p>
+            <w:pPr>
+              <w:spacing w:after="40"/>
+            </w:pPr>
+            <w:r>
+              <w:rPr>
+                <w:sz w:val="19"/>
+              </w:rPr>
+              <w:t>Seniors calling assessors for a nonexistent "senior homeowner tax review"; the assessor on AI as a new challenge.</w:t>
+            </w:r>
+          </w:p>
+        </w:tc>
+        <w:tc>
+          <w:tcPr>
+            <w:tcW w:type="dxa" w:w="2376"/>
+          </w:tcPr>
+          <w:p>
+            <w:pPr>
+              <w:spacing w:after="40"/>
+            </w:pPr>
+            <w:r>
+              <w:rPr>
+                <w:sz w:val="19"/>
+              </w:rPr>
+              <w:t>0:28–0:54 "whole new challenge"</w:t>
+            </w:r>
+          </w:p>
+        </w:tc>
+        <w:tc>
+          <w:tcPr>
+            <w:tcW w:type="dxa" w:w="1368"/>
+          </w:tcPr>
+          <w:p>
+            <w:pPr>
+              <w:spacing w:after="40"/>
+            </w:pPr>
+            <w:r>
+              <w:rPr>
+                <w:sz w:val="19"/>
+              </w:rPr>
+              <w:t>PICK</w:t>
+            </w:r>
+          </w:p>
+        </w:tc>
+      </w:tr>
+    </w:tbl>
+    <w:p/>
+    <w:p>
+      <w:pPr>
+        <w:pStyle w:val="Heading3"/>
+      </w:pPr>
+      <w:r>
+        <w:rPr>
+          <w:color w:val="333333"/>
+          <w:sz w:val="22"/>
+        </w:rPr>
         <w:t>The fix</w:t>
       </w:r>
     </w:p>
@@ -2595,7 +3878,16 @@
         <w:spacing w:after="40"/>
       </w:pPr>
       <w:r>
-        <w:t>⚠️ Local warning clips are all under 1,000 views. The scam video itself may be down.</w:t>
+        <w:t>⚠️ Local warning clips are all under 1,000 views. Both C picks are one Denver7 piece (Aug 8); WXOW (Wisconsin, 39s) is the alternate.</w:t>
+      </w:r>
+    </w:p>
+    <w:p>
+      <w:pPr>
+        <w:pStyle w:val="ListBullet"/>
+        <w:spacing w:after="40"/>
+      </w:pPr>
+      <w:r>
+        <w:t>⚠️ WXOW says "Form 1096-SR"; Wisconsin's revenue department says "1098-SR." Use 1098-SR.</w:t>
       </w:r>
     </w:p>
     <w:sectPr>

</xml_diff>

<commit_message>
W 10-14: A story cut to 5 clips (CBS repeats merged, A3 trimmed); outline rebuilt
Co-Authored-By: Claude Opus 5.5 <noreply@anthropic.com>
Claude-Session: https://claude.ai/code/session_01F5T5EfKU7bvTfCbU31zr39
</commit_message>
<xml_diff>
--- a/runs/W_10142026/10_14_OUTLINE_WED.docx
+++ b/runs/W_10142026/10_14_OUTLINE_WED.docx
@@ -271,7 +271,7 @@
               <w:rPr>
                 <w:sz w:val="19"/>
               </w:rPr>
-              <w:t>6/6</w:t>
+              <w:t>5/5</w:t>
             </w:r>
           </w:p>
         </w:tc>
@@ -305,7 +305,7 @@
               <w:rPr>
                 <w:sz w:val="19"/>
               </w:rPr>
-              <w:t>OmniWatch — after A beat 8 (the fix)</w:t>
+              <w:t>OmniWatch — after A beat 7 (the fix)</w:t>
             </w:r>
           </w:p>
         </w:tc>
@@ -678,7 +678,7 @@
         <w:spacing w:after="40"/>
       </w:pPr>
       <w:r>
-        <w:t>A runs 6 clip beats against Matt's guide of about two per segment. Producer, 10/6: keep all six for now; beats 5 and 6 (both CBS LA) are the first cut if A runs long.</w:t>
+        <w:t>A cut from 6 clips to 5 (producer, 10/7): the three CBS LA pieces repeated Chisholm's "Uh no, I did not" and Sherman's AG line, so beats 5 and 6 merged into one CBS clip that shows the sample pitch and the closed store. A3 trimmed to one segment so it doesn't repeat A2's shame beat. If A runs long, cut A3 next.</w:t>
       </w:r>
     </w:p>
     <w:p>
@@ -750,7 +750,7 @@
         <w:spacing w:after="40"/>
       </w:pPr>
       <w:r>
-        <w:t>No expert this week (producer, 10/6). A beat 8 and B beat 4 stay with Jeff.</w:t>
+        <w:t>No expert this week (producer, 10/6). A beat 7 and B beat 4 stay with Jeff.</w:t>
       </w:r>
     </w:p>
     <w:p>
@@ -800,7 +800,7 @@
         <w:t>Weight:</w:t>
       </w:r>
       <w:r>
-        <w:t xml:space="preserve"> ~50% of show · 6 clip beats</w:t>
+        <w:t xml:space="preserve"> ~50% of show · 5 clip beats</w:t>
       </w:r>
     </w:p>
     <w:tbl>
@@ -1247,7 +1247,7 @@
               <w:rPr>
                 <w:sz w:val="19"/>
               </w:rPr>
-              <w:t>It gets worse</w:t>
+              <w:t>Caught on camera</w:t>
             </w:r>
           </w:p>
         </w:tc>
@@ -1263,7 +1263,7 @@
               <w:rPr>
                 <w:sz w:val="19"/>
               </w:rPr>
-              <w:t>Rep. Brad Sherman; two women in their 80s, Arcadia</w:t>
+              <w:t>CBS LA's Kristine Lazar; Bee &amp; Co.'s lawyer</w:t>
             </w:r>
           </w:p>
         </w:tc>
@@ -1279,7 +1279,7 @@
               <w:rPr>
                 <w:sz w:val="19"/>
               </w:rPr>
-              <w:t>A congressman takes it to the attorney general, and two women in their 80s say they were pressured at sister stores.</w:t>
+              <w:t>Cameras catch workers pushing samples at shoppers; the Topanga store goes dark Sept 24, and the company calls the coverage one-sided.</w:t>
             </w:r>
           </w:p>
         </w:tc>
@@ -1329,88 +1329,6 @@
               <w:rPr>
                 <w:sz w:val="19"/>
               </w:rPr>
-              <w:t>The store goes dark</w:t>
-            </w:r>
-          </w:p>
-        </w:tc>
-        <w:tc>
-          <w:tcPr>
-            <w:tcW w:type="dxa" w:w="2160"/>
-          </w:tcPr>
-          <w:p>
-            <w:pPr>
-              <w:spacing w:after="40"/>
-            </w:pPr>
-            <w:r>
-              <w:rPr>
-                <w:sz w:val="19"/>
-              </w:rPr>
-              <w:t>Rep. Brad Sherman; Bee &amp; Co. attorney Neville Johnson</w:t>
-            </w:r>
-          </w:p>
-        </w:tc>
-        <w:tc>
-          <w:tcPr>
-            <w:tcW w:type="dxa" w:w="4104"/>
-          </w:tcPr>
-          <w:p>
-            <w:pPr>
-              <w:spacing w:after="40"/>
-            </w:pPr>
-            <w:r>
-              <w:rPr>
-                <w:sz w:val="19"/>
-              </w:rPr>
-              <w:t>The Topanga store closes Sept 24; the company calls the coverage one-sided and misleading.</w:t>
-            </w:r>
-          </w:p>
-        </w:tc>
-        <w:tc>
-          <w:tcPr>
-            <w:tcW w:type="dxa" w:w="1584"/>
-          </w:tcPr>
-          <w:p>
-            <w:pPr>
-              <w:spacing w:after="40"/>
-            </w:pPr>
-            <w:r>
-              <w:rPr>
-                <w:sz w:val="19"/>
-              </w:rPr>
-              <w:t>HAVE · HORIZONTAL — CBS LA</w:t>
-            </w:r>
-          </w:p>
-        </w:tc>
-      </w:tr>
-      <w:tr>
-        <w:tc>
-          <w:tcPr>
-            <w:tcW w:type="dxa" w:w="432"/>
-          </w:tcPr>
-          <w:p>
-            <w:pPr>
-              <w:spacing w:after="40"/>
-            </w:pPr>
-            <w:r>
-              <w:rPr>
-                <w:sz w:val="19"/>
-              </w:rPr>
-              <w:t>7</w:t>
-            </w:r>
-          </w:p>
-        </w:tc>
-        <w:tc>
-          <w:tcPr>
-            <w:tcW w:type="dxa" w:w="1656"/>
-          </w:tcPr>
-          <w:p>
-            <w:pPr>
-              <w:spacing w:after="40"/>
-            </w:pPr>
-            <w:r>
-              <w:rPr>
-                <w:sz w:val="19"/>
-              </w:rPr>
               <w:t>Coast to coast</w:t>
             </w:r>
           </w:p>
@@ -1443,7 +1361,7 @@
               <w:rPr>
                 <w:sz w:val="19"/>
               </w:rPr>
-              <w:t>A kiosk owner is arrested after allegedly pushing her to withdraw $50,000, and nearby kiosks close.</w:t>
+              <w:t>A kiosk owner is arrested after allegedly pushing her to withdraw $50,000; two bank tellers stop it.</w:t>
             </w:r>
           </w:p>
         </w:tc>
@@ -1477,7 +1395,7 @@
               <w:rPr>
                 <w:sz w:val="19"/>
               </w:rPr>
-              <w:t>8</w:t>
+              <w:t>7</w:t>
             </w:r>
           </w:p>
         </w:tc>
@@ -1780,7 +1698,7 @@
               <w:rPr>
                 <w:sz w:val="19"/>
               </w:rPr>
-              <w:t>Lettie, 79: free facials as lures, "pressured, pressured, pressured," said no 50 to 60 times; $25,000 on Social Security. 4:02.</w:t>
+              <w:t>Lettie, 79: free facials as lures, "pressured, pressured, pressured," said no 50 to 60 times. 4:02.</w:t>
             </w:r>
           </w:p>
         </w:tc>
@@ -1796,7 +1714,7 @@
               <w:rPr>
                 <w:sz w:val="19"/>
               </w:rPr>
-              <w:t>1:09–1:37 "times, at least" BUTT 1:52–2:09 "I'm ashamed"</w:t>
+              <w:t>1:09–1:37 "times, at least"</w:t>
             </w:r>
           </w:p>
         </w:tc>
@@ -1933,7 +1851,7 @@
                   <w:color w:val="1155CC"/>
                   <w:u w:val="single"/>
                 </w:rPr>
-                <w:t xml:space="preserve">CBS LA — Bee &amp; Co. faces new allegations of coercive sales</w:t>
+                <w:t xml:space="preserve">CBS LA — Bee &amp; Co. skincare store closes</w:t>
               </w:r>
             </w:hyperlink>
           </w:p>
@@ -1950,7 +1868,7 @@
               <w:rPr>
                 <w:sz w:val="19"/>
               </w:rPr>
-              <w:t>Rep. Sherman to take it to AG Bonta; two women in their 80s and small-claims settlements. Uploaded Sept 23, 2026, 6:15.</w:t>
+              <w:t>The boarded-up store; "Do you feel you're doing anything wrong?"; workers "pushing samples" to lure shoppers; then the company lawyer's letter. Uploaded Oct 1, 2026, 4:04.</w:t>
             </w:r>
           </w:p>
         </w:tc>
@@ -1966,7 +1884,7 @@
               <w:rPr>
                 <w:sz w:val="19"/>
               </w:rPr>
-              <w:t>2:04–2:37 "our state attorney general" BUTT 4:41–5:09 "independently operated tenant"</w:t>
+              <w:t>0:22–1:01 "trying to lure shoppers inside" BUTT 3:03–3:27 "making large purchases at multiple stores"</w:t>
             </w:r>
           </w:p>
         </w:tc>
@@ -2013,91 +1931,6 @@
               <w:spacing w:after="40"/>
             </w:pPr>
             <w:hyperlink r:id="rId13">
-              <w:r>
-                <w:rPr>
-                  <w:color w:val="1155CC"/>
-                  <w:u w:val="single"/>
-                </w:rPr>
-                <w:t xml:space="preserve">CBS LA — Bee &amp; Co. skincare store closes</w:t>
-              </w:r>
-            </w:hyperlink>
-          </w:p>
-        </w:tc>
-        <w:tc>
-          <w:tcPr>
-            <w:tcW w:type="dxa" w:w="3096"/>
-          </w:tcPr>
-          <w:p>
-            <w:pPr>
-              <w:spacing w:after="40"/>
-            </w:pPr>
-            <w:r>
-              <w:rPr>
-                <w:sz w:val="19"/>
-              </w:rPr>
-              <w:t>The deserted storefront and lockbox; then the company lawyer's letter calling coverage one-sided. Uploaded Oct 1, 2026, 4:04.</w:t>
-            </w:r>
-          </w:p>
-        </w:tc>
-        <w:tc>
-          <w:tcPr>
-            <w:tcW w:type="dxa" w:w="2376"/>
-          </w:tcPr>
-          <w:p>
-            <w:pPr>
-              <w:spacing w:after="40"/>
-            </w:pPr>
-            <w:r>
-              <w:rPr>
-                <w:sz w:val="19"/>
-              </w:rPr>
-              <w:t>0:22–0:33 "the B and Co name remains" BUTT 3:03–3:27 "making large purchases at multiple stores"</w:t>
-            </w:r>
-          </w:p>
-        </w:tc>
-        <w:tc>
-          <w:tcPr>
-            <w:tcW w:type="dxa" w:w="1368"/>
-          </w:tcPr>
-          <w:p>
-            <w:pPr>
-              <w:spacing w:after="40"/>
-            </w:pPr>
-            <w:r>
-              <w:rPr>
-                <w:sz w:val="19"/>
-              </w:rPr>
-              <w:t>PICK</w:t>
-            </w:r>
-          </w:p>
-        </w:tc>
-      </w:tr>
-      <w:tr>
-        <w:tc>
-          <w:tcPr>
-            <w:tcW w:type="dxa" w:w="432"/>
-          </w:tcPr>
-          <w:p>
-            <w:pPr>
-              <w:spacing w:after="40"/>
-            </w:pPr>
-            <w:r>
-              <w:rPr>
-                <w:sz w:val="19"/>
-              </w:rPr>
-              <w:t>7</w:t>
-            </w:r>
-          </w:p>
-        </w:tc>
-        <w:tc>
-          <w:tcPr>
-            <w:tcW w:type="dxa" w:w="2664"/>
-          </w:tcPr>
-          <w:p>
-            <w:pPr>
-              <w:spacing w:after="40"/>
-            </w:pPr>
-            <w:hyperlink r:id="rId14">
               <w:r>
                 <w:rPr>
                   <w:color w:val="1155CC"/>
@@ -2225,7 +2058,7 @@
         <w:spacing w:after="40"/>
       </w:pPr>
       <w:r>
-        <w:t>⚠️ Beats 4–7: accused of high-pressure sales, not charged with fraud (the Vancouver arrest is a separate case). Every line gets attribution and the company's response.</w:t>
+        <w:t>⚠️ Beats 4–6: accused of high-pressure sales, not charged with fraud (the Vancouver arrest is a separate case). Every line gets attribution and the company's response.</w:t>
       </w:r>
     </w:p>
     <w:p>
@@ -2243,7 +2076,7 @@
         <w:spacing w:after="40"/>
       </w:pPr>
       <w:r>
-        <w:t>⚠️ Beat 7: Donna asked not to show her face.</w:t>
+        <w:t>⚠️ Beat 6: Donna asked not to show her face.</w:t>
       </w:r>
     </w:p>
     <w:p>
@@ -2837,7 +2670,7 @@
             <w:pPr>
               <w:spacing w:after="40"/>
             </w:pPr>
-            <w:hyperlink r:id="rId15">
+            <w:hyperlink r:id="rId14">
               <w:r>
                 <w:rPr>
                   <w:color w:val="1155CC"/>
@@ -2922,7 +2755,7 @@
             <w:pPr>
               <w:spacing w:after="40"/>
             </w:pPr>
-            <w:hyperlink r:id="rId16">
+            <w:hyperlink r:id="rId15">
               <w:r>
                 <w:rPr>
                   <w:color w:val="1155CC"/>
@@ -3007,7 +2840,7 @@
             <w:pPr>
               <w:spacing w:after="40"/>
             </w:pPr>
-            <w:hyperlink r:id="rId17">
+            <w:hyperlink r:id="rId16">
               <w:r>
                 <w:rPr>
                   <w:color w:val="1155CC"/>
@@ -3656,7 +3489,7 @@
             <w:pPr>
               <w:spacing w:after="40"/>
             </w:pPr>
-            <w:hyperlink r:id="rId18">
+            <w:hyperlink r:id="rId17">
               <w:r>
                 <w:rPr>
                   <w:color w:val="1155CC"/>
@@ -3741,7 +3574,7 @@
             <w:pPr>
               <w:spacing w:after="40"/>
             </w:pPr>
-            <w:hyperlink r:id="rId18">
+            <w:hyperlink r:id="rId17">
               <w:r>
                 <w:rPr>
                   <w:color w:val="1155CC"/>

</xml_diff>

<commit_message>
W 10-14: C replaced with Walmart register-vs-shelf-tag story (two producer TikToks, manual lane); outline rebuilt
Co-Authored-By: Claude Opus 5.5 <noreply@anthropic.com>
Claude-Session: https://claude.ai/code/session_01F5T5EfKU7bvTfCbU31zr39
</commit_message>
<xml_diff>
--- a/runs/W_10142026/10_14_OUTLINE_WED.docx
+++ b/runs/W_10142026/10_14_OUTLINE_WED.docx
@@ -173,7 +173,7 @@
               <w:rPr>
                 <w:sz w:val="19"/>
               </w:rPr>
-              <w:t>The $26,000 free sample, the caregiver who took the house for $5, the fake property-tax video</w:t>
+              <w:t>The $26,000 free sample, the caregiver who took the house for $5, the Walmart register that rings up more than the sign</w:t>
             </w:r>
           </w:p>
         </w:tc>
@@ -503,7 +503,7 @@
               <w:rPr>
                 <w:sz w:val="19"/>
               </w:rPr>
-              <w:t>If you see this video about your property taxes, it's fake</w:t>
+              <w:t>The sign said $1. The register said something else.</w:t>
             </w:r>
           </w:p>
         </w:tc>
@@ -622,7 +622,7 @@
     </w:p>
     <w:p>
       <w:r>
-        <w:t>A free sample at the mall turns into a chair, a pitch and a bill in the tens of thousands, and the same playbook is hitting older shoppers from Florida to Washington. A daughter rang her father's doorbell and heard his caregiver say he had died, then learned the caregiver had become his power of attorney and signed his house over to herself for $5. A fake AI "government" video wants your Social Security number for a tax freeze that doesn't exist, and every one of these has a one-line fix.</w:t>
+        <w:t>A free sample at the mall turns into a chair, a pitch and a bill in the tens of thousands, and the same playbook is hitting older shoppers from Florida to Washington. A daughter rang her father's doorbell and heard his caregiver say he had died, then learned the caregiver had become his power of attorney and signed his house over to herself for $5. And at Walmart, the register is ringing up more than the sign says. Every one of these has a one-line fix.</w:t>
       </w:r>
     </w:p>
     <w:p>
@@ -639,7 +639,7 @@
     </w:p>
     <w:p>
       <w:r>
-        <w:t>A builds through four victims to a store going dark and exhales on the fix. B is the darkest stretch (a death, a daughter treated as a trespasser) and lands on the arrest. C is quick and practical. The show exhales on C, not on a good-news closer.</w:t>
+        <w:t>A builds through four victims to a store going dark and exhales on the fix. B is the darkest stretch (a death, a daughter treated as a trespasser) and lands on the arrest. C is quick, relatable and practical, and the show exhales on it.</w:t>
       </w:r>
     </w:p>
     <w:p>
@@ -714,7 +714,7 @@
         <w:spacing w:after="40"/>
       </w:pPr>
       <w:r>
-        <w:t>C: the "file by Oct 15" deadline is unsourced. Drop it unless someone finds it in the video.</w:t>
+        <w:t>C replaced 10/7 (producer): Walmart shelf-tag vs register pricing, two producer-picked TikToks (MANUAL · UNVERIFIED, no transcript). Note Kroger shelf-vs-register aired Sept 18.</w:t>
       </w:r>
     </w:p>
     <w:p>
@@ -723,25 +723,7 @@
         <w:spacing w:after="40"/>
       </w:pPr>
       <w:r>
-        <w:t>C has no victim. Producer, 10/6: beat 1 runs as B-roll of the fake video with Jeff talking over it. Denver7 plays the fake video; no real channel is labelled as the scam.</w:t>
-      </w:r>
-    </w:p>
-    <w:p>
-      <w:pPr>
-        <w:pStyle w:val="ListBullet"/>
-        <w:spacing w:after="40"/>
-      </w:pPr>
-      <w:r>
-        <w:t>C: the Colorado assessor thinks the videos exist to sell ad clicks; Wisconsin's revenue department says the phone numbers reach scammers. Attribute each.</w:t>
-      </w:r>
-    </w:p>
-    <w:p>
-      <w:pPr>
-        <w:pStyle w:val="ListBullet"/>
-        <w:spacing w:after="40"/>
-      </w:pPr>
-      <w:r>
-        <w:t>Picks: 11/11, all affiliate or network news (no first-person or creator option cleared the filters). No EMPTY, WEAK or THROTTLED beats.</w:t>
+        <w:t>Picks: A and B 8/8 verified against transcripts, all affiliate or network news; C 2/2 manual.</w:t>
       </w:r>
     </w:p>
     <w:p>
@@ -2994,7 +2976,7 @@
           <w:color w:val="000000"/>
           <w:sz w:val="32"/>
         </w:rPr>
-        <w:t>C. IF YOU SEE THIS VIDEO ABOUT YOUR PROPERTY TAXES, IT'S FAKE</w:t>
+        <w:t>C. THE SIGN SAID $1. THE REGISTER SAID SOMETHING ELSE.</w:t>
       </w:r>
     </w:p>
     <w:p>
@@ -3005,7 +2987,7 @@
         <w:t>In one sentence:</w:t>
       </w:r>
       <w:r>
-        <w:t xml:space="preserve"> A fake AI video tells seniors Congress froze their property taxes and pushes a form that doesn't exist; Wisconsin officials say the phone number reaches scammers who want your Social Security number.</w:t>
+        <w:t xml:space="preserve"> Shoppers are filming Walmart registers ringing up more than the sale sign or digital shelf tag says, and the fix is watching the screen and asking for the shelf price.</w:t>
       </w:r>
     </w:p>
     <w:p>
@@ -3016,7 +2998,7 @@
         <w:t>Peg:</w:t>
       </w:r>
       <w:r>
-        <w:t xml:space="preserve"> Official warnings from Wisconsin (Sept 3–11), Ohio, California and Colorado, still circulating into October.</w:t>
+        <w:t xml:space="preserve"> Viral TikToks this fall, a growing pile of complaints about Walmart's new digital shelf labels, and Walmart's $5.6 million California settlement over scanner overcharges (Aug 2025), which put it on a price-accuracy program through 2028.</w:t>
       </w:r>
     </w:p>
     <w:p>
@@ -3146,7 +3128,7 @@
               <w:rPr>
                 <w:sz w:val="19"/>
               </w:rPr>
-              <w:t>The fake video</w:t>
+              <w:t>The $1 sign</w:t>
             </w:r>
           </w:p>
         </w:tc>
@@ -3162,7 +3144,7 @@
               <w:rPr>
                 <w:sz w:val="19"/>
               </w:rPr>
-              <w:t>Unnamed — scammers behind an AI video, no victim found</w:t>
+              <w:t>Amanda, Kansas shopper (TikTok "Queen Abomb")</w:t>
             </w:r>
           </w:p>
         </w:tc>
@@ -3178,7 +3160,7 @@
               <w:rPr>
                 <w:sz w:val="19"/>
               </w:rPr>
-              <w:t>The video claims a new federal senior tax freeze and a "Senior Homeowner Tax Review Request" form.</w:t>
+              <w:t>A rollback sign says $1, down from $1.34; self-checkout rings the lasagna up at $1.44, and an employee overrides it.</w:t>
             </w:r>
           </w:p>
         </w:tc>
@@ -3194,7 +3176,7 @@
               <w:rPr>
                 <w:sz w:val="19"/>
               </w:rPr>
-              <w:t>FIND · HORIZONTAL BROLL — the scam video or a news grab of it</w:t>
+              <w:t>HAVE · VERTICAL — TikTok @amandabainum457</w:t>
             </w:r>
           </w:p>
         </w:tc>
@@ -3228,7 +3210,7 @@
               <w:rPr>
                 <w:sz w:val="19"/>
               </w:rPr>
-              <w:t>The warning</w:t>
+              <w:t>The digital tag</w:t>
             </w:r>
           </w:p>
         </w:tc>
@@ -3244,7 +3226,7 @@
               <w:rPr>
                 <w:sz w:val="19"/>
               </w:rPr>
-              <w:t>Douglas County, Colorado assessor; Wisconsin revenue secretary David Casey</w:t>
+              <w:t>Jimmy Wrigg, shopper and creator (TikTok @james_wrigg)</w:t>
             </w:r>
           </w:p>
         </w:tc>
@@ -3260,7 +3242,7 @@
               <w:rPr>
                 <w:sz w:val="19"/>
               </w:rPr>
-              <w:t>Seniors call assessors asking for a form that doesn't exist; officials say no such federal program exists.</w:t>
+              <w:t>He films Walmart's digital shelf tags and the prices they show against what rings up, per his caption.</w:t>
             </w:r>
           </w:p>
         </w:tc>
@@ -3276,7 +3258,7 @@
               <w:rPr>
                 <w:sz w:val="19"/>
               </w:rPr>
-              <w:t>FIND · HORIZONTAL — local news warning</w:t>
+              <w:t>HAVE · VERTICAL — TikTok @james_wrigg</w:t>
             </w:r>
           </w:p>
         </w:tc>
@@ -3342,7 +3324,7 @@
               <w:rPr>
                 <w:sz w:val="19"/>
               </w:rPr>
-              <w:t>Property taxes are local; call the number on your tax bill and never give your SSN to "file."</w:t>
+              <w:t>Watch the screen as each item scans, ask for the shelf price, and check the receipt before you leave.</w:t>
             </w:r>
           </w:p>
         </w:tc>
@@ -3495,7 +3477,7 @@
                   <w:color w:val="1155CC"/>
                   <w:u w:val="single"/>
                 </w:rPr>
-                <w:t xml:space="preserve">Denver7 — Assessor warns about viral AI property tax scam</w:t>
+                <w:t xml:space="preserve">Queen Abomb (@amandabainum457) — Walmart rollback rings up higher</w:t>
               </w:r>
             </w:hyperlink>
           </w:p>
@@ -3512,7 +3494,7 @@
               <w:rPr>
                 <w:sz w:val="19"/>
               </w:rPr>
-              <w:t>Plays the fake AI video ("The programs are real. The savings are real…"), then "the person in the video is not real either." Aug 8, 2026, 1:34.</w:t>
+              <w:t>Per caption and press write-up: $1 rollback sign, $1.44 at self-checkout, employee override. Captioned #walmartpricegouge.</w:t>
             </w:r>
           </w:p>
         </w:tc>
@@ -3528,7 +3510,7 @@
               <w:rPr>
                 <w:sz w:val="19"/>
               </w:rPr>
-              <w:t>0:12–0:27 "It's completely AI"</w:t>
+              <w:t>—</w:t>
             </w:r>
           </w:p>
         </w:tc>
@@ -3544,7 +3526,7 @@
               <w:rPr>
                 <w:sz w:val="19"/>
               </w:rPr>
-              <w:t>PICK</w:t>
+              <w:t>MANUAL · UNVERIFIED</w:t>
             </w:r>
           </w:p>
         </w:tc>
@@ -3574,13 +3556,13 @@
             <w:pPr>
               <w:spacing w:after="40"/>
             </w:pPr>
-            <w:hyperlink r:id="rId17">
+            <w:hyperlink r:id="rId18">
               <w:r>
                 <w:rPr>
                   <w:color w:val="1155CC"/>
                   <w:u w:val="single"/>
                 </w:rPr>
-                <w:t xml:space="preserve">Denver7 — Assessor warns about viral AI property tax scam</w:t>
+                <w:t xml:space="preserve">Jimmy Wrigg (@james_wrigg) — Digital price tags and pricing</w:t>
               </w:r>
             </w:hyperlink>
           </w:p>
@@ -3597,7 +3579,7 @@
               <w:rPr>
                 <w:sz w:val="19"/>
               </w:rPr>
-              <w:t>Seniors calling assessors for a nonexistent "senior homeowner tax review"; the assessor on AI as a new challenge.</w:t>
+              <w:t>Per caption only: "Digital Price Tags And Pricing." Content not confirmed.</w:t>
             </w:r>
           </w:p>
         </w:tc>
@@ -3613,7 +3595,7 @@
               <w:rPr>
                 <w:sz w:val="19"/>
               </w:rPr>
-              <w:t>0:28–0:54 "whole new challenge"</w:t>
+              <w:t>—</w:t>
             </w:r>
           </w:p>
         </w:tc>
@@ -3629,7 +3611,7 @@
               <w:rPr>
                 <w:sz w:val="19"/>
               </w:rPr>
-              <w:t>PICK</w:t>
+              <w:t>MANUAL · UNVERIFIED</w:t>
             </w:r>
           </w:p>
         </w:tc>
@@ -3654,7 +3636,7 @@
         <w:spacing w:after="40"/>
       </w:pPr>
       <w:r>
-        <w:t>Property taxes are set by your county and state, never by Congress. There is no federal form.</w:t>
+        <w:t>Watch the screen as each item scans. Don't bag and look away.</w:t>
       </w:r>
     </w:p>
     <w:p>
@@ -3663,7 +3645,7 @@
         <w:spacing w:after="40"/>
       </w:pPr>
       <w:r>
-        <w:t>Call your assessor at the number on your tax bill, not one from a video.</w:t>
+        <w:t>Price higher than the sign? Ask for the shelf price before you pay; snap a photo of the sign.</w:t>
       </w:r>
     </w:p>
     <w:p>
@@ -3672,7 +3654,7 @@
         <w:spacing w:after="40"/>
       </w:pPr>
       <w:r>
-        <w:t>Never give your Social Security number to "file" for a freeze.</w:t>
+        <w:t>Check the receipt before you leave the store, not at home.</w:t>
       </w:r>
     </w:p>
     <w:p>
@@ -3693,7 +3675,7 @@
         <w:spacing w:after="40"/>
       </w:pPr>
       <w:r>
-        <w:t>⚠️ No victim found. The story is the warning, not a person.</w:t>
+        <w:t>⚠️ Kroger shelf-vs-register pricing aired Sept 18 (F1). This is the same complaint at a different chain, four weeks later. The new angle is the digital shelf tags.</w:t>
       </w:r>
     </w:p>
     <w:p>
@@ -3702,7 +3684,7 @@
         <w:spacing w:after="40"/>
       </w:pPr>
       <w:r>
-        <w:t>⚠️ The "file by Oct 15" deadline is unsourced.</w:t>
+        <w:t>⚠️ Amanda scanned one can on camera; the press write-up says it's unclear whether the rest rang up the same. Say "this can," not "the whole display."</w:t>
       </w:r>
     </w:p>
     <w:p>
@@ -3711,7 +3693,7 @@
         <w:spacing w:after="40"/>
       </w:pPr>
       <w:r>
-        <w:t>⚠️ Local warning clips are all under 1,000 views. Both C picks are one Denver7 piece (Aug 8); WXOW (Wisconsin, 39s) is the alternate.</w:t>
+        <w:t>⚠️ Both clips are native TikToks: no transcripts reached (media download blocked), so no in–out or outcue. Kyle sets them when he pulls. Clip 2's content is known only from its caption.</w:t>
       </w:r>
     </w:p>
     <w:p>
@@ -3720,7 +3702,16 @@
         <w:spacing w:after="40"/>
       </w:pPr>
       <w:r>
-        <w:t>⚠️ WXOW says "Form 1096-SR"; Wisconsin's revenue department says "1098-SR." Use 1098-SR.</w:t>
+        <w:t>⚠️ "Price scam" is the creators' word. Walmart says its digital labels don't use personal data to set prices; attribute any intent claims. Get Walmart's response.</w:t>
+      </w:r>
+    </w:p>
+    <w:p>
+      <w:pPr>
+        <w:pStyle w:val="ListBullet"/>
+        <w:spacing w:after="40"/>
+      </w:pPr>
+      <w:r>
+        <w:t>⚠️ Walmart does not have a national "item free if it scans wrong" policy that I found; some states have scanner laws (verify before naming any).</w:t>
       </w:r>
     </w:p>
     <w:sectPr>

</xml_diff>